<commit_message>
Store daily recap Word us_market_recap_2026-10-22_BJT_us_2026-10-21_final
</commit_message>
<xml_diff>
--- a/reports/us_market_recap_2026-10-22_BJT_us_2026-10-21_final.docx
+++ b/reports/us_market_recap_2026-10-22_BJT_us_2026-10-21_final.docx
@@ -1013,7 +1013,7 @@
                 <w:color w:val="141414"/>
                 <w:sz w:val="16"/>
               </w:rPr>
-              <w:t>101.69 / 97.94 / 8.42万美元</w:t>
+              <w:t>101.68 / 97.96 / 8.41万美元</w:t>
             </w:r>
           </w:p>
         </w:tc>
@@ -1040,7 +1040,7 @@
                 <w:color w:val="141414"/>
                 <w:sz w:val="16"/>
               </w:rPr>
-              <w:t>DXY -0.04% / WTI -3.78% / BTC +1.54%</w:t>
+              <w:t>DXY -0.05% / WTI -3.76% / BTC +1.35%</w:t>
             </w:r>
           </w:p>
         </w:tc>
@@ -9085,7 +9085,7 @@
           <w:color w:val="555555"/>
           <w:sz w:val="17"/>
         </w:rPr>
-        <w:t>图：公开期权链异常扫描。来源/口径：Nasdaq public option-chain endpoint；检查时点 2026-10-21T19:13:10-04:00；无执行方向确认。。</w:t>
+        <w:t>图：公开期权链异常扫描。来源/口径：Nasdaq public option-chain endpoint；检查时点 2026-10-21T19:59:37-04:00；无执行方向确认。。</w:t>
       </w:r>
     </w:p>
     <w:p>

</xml_diff>